<commit_message>
add page numbering report lab2
</commit_message>
<xml_diff>
--- a/lab2/отчет по лабораторной 2.docx
+++ b/lab2/отчет по лабораторной 2.docx
@@ -104,8 +104,16 @@
         <w:rPr>
           <w:sz w:val="40"/>
         </w:rPr>
-        <w:t>Лабораторная работа 2. Работа с Git</w:t>
-      </w:r>
+        <w:t xml:space="preserve">Лабораторная работа 2. Работа с </w:t>
+      </w:r>
+      <w:proofErr w:type="spellStart"/>
+      <w:r>
+        <w:rPr>
+          <w:sz w:val="40"/>
+        </w:rPr>
+        <w:t>Git</w:t>
+      </w:r>
+      <w:proofErr w:type="spellEnd"/>
     </w:p>
     <w:p>
       <w:pPr>
@@ -277,31 +285,41 @@
         <w:t xml:space="preserve">                                                                                                      </w:t>
       </w:r>
       <w:r>
-        <w:t>А. С. Козионов</w:t>
-      </w:r>
+        <w:t xml:space="preserve">А. С. </w:t>
+      </w:r>
+      <w:proofErr w:type="spellStart"/>
+      <w:r>
+        <w:t>Козионов</w:t>
+      </w:r>
+      <w:proofErr w:type="spellEnd"/>
       <w:r>
         <w:t xml:space="preserve"> </w:t>
       </w:r>
+    </w:p>
+    <w:p>
+      <w:pPr>
+        <w:spacing w:after="2640"/>
+        <w:ind w:left="-6" w:hanging="11"/>
+      </w:pPr>
+      <w:r>
+        <w:t xml:space="preserve">Преподаватель  </w:t>
+      </w:r>
+      <w:r>
+        <w:t xml:space="preserve">                                                                                                 </w:t>
+      </w:r>
+      <w:r>
+        <w:t xml:space="preserve">М.В. </w:t>
+      </w:r>
+      <w:proofErr w:type="spellStart"/>
+      <w:r>
+        <w:t>Водяницкий</w:t>
+      </w:r>
+      <w:proofErr w:type="spellEnd"/>
     </w:p>
     <w:p>
       <w:pPr>
         <w:spacing w:after="2946"/>
         <w:ind w:left="-5"/>
-      </w:pPr>
-      <w:r>
-        <w:t xml:space="preserve">Преподаватель  </w:t>
-      </w:r>
-      <w:r>
-        <w:t xml:space="preserve">                                                                                                 </w:t>
-      </w:r>
-      <w:r>
-        <w:t>М.В. Водяницкий</w:t>
-      </w:r>
-    </w:p>
-    <w:p>
-      <w:pPr>
-        <w:spacing w:after="219"/>
-        <w:ind w:right="48"/>
         <w:jc w:val="center"/>
       </w:pPr>
       <w:r>
@@ -315,6 +333,7 @@
         <w:jc w:val="right"/>
       </w:pPr>
       <w:r>
+        <w:lastRenderedPageBreak/>
         <w:t>2</w:t>
       </w:r>
     </w:p>
@@ -329,7 +348,6 @@
           <w:rFonts w:ascii="Arial" w:eastAsia="Arial" w:hAnsi="Arial" w:cs="Arial"/>
           <w:sz w:val="28"/>
         </w:rPr>
-        <w:lastRenderedPageBreak/>
         <w:t>1 Выполнение работы</w:t>
       </w:r>
     </w:p>
@@ -339,7 +357,15 @@
         <w:ind w:left="719"/>
       </w:pPr>
       <w:r>
-        <w:t xml:space="preserve">В задании требуется создать пустой удаленный репозиторий cs-programming-labs. </w:t>
+        <w:t xml:space="preserve">В задании требуется создать пустой удаленный репозиторий </w:t>
+      </w:r>
+      <w:proofErr w:type="spellStart"/>
+      <w:r>
+        <w:t>cs-programming-labs</w:t>
+      </w:r>
+      <w:proofErr w:type="spellEnd"/>
+      <w:r>
+        <w:t xml:space="preserve">. </w:t>
       </w:r>
     </w:p>
     <w:p>
@@ -348,7 +374,28 @@
         <w:ind w:left="-5"/>
       </w:pPr>
       <w:r>
-        <w:t>Далее, требуется объявить локальный репозиторий cs-programming-labs c .gitignore и README.md файлами. Загрузить лабораторную работу 1, и загрузить изменения на удаленный репозиторий путем сохранения изменений в коммитах.</w:t>
+        <w:t xml:space="preserve">Далее, требуется объявить локальный репозиторий </w:t>
+      </w:r>
+      <w:proofErr w:type="spellStart"/>
+      <w:r>
+        <w:t>cs-programming-labs</w:t>
+      </w:r>
+      <w:proofErr w:type="spellEnd"/>
+      <w:r>
+        <w:t xml:space="preserve"> </w:t>
+      </w:r>
+      <w:proofErr w:type="gramStart"/>
+      <w:r>
+        <w:t>c .</w:t>
+      </w:r>
+      <w:proofErr w:type="spellStart"/>
+      <w:r>
+        <w:t>gitignore</w:t>
+      </w:r>
+      <w:proofErr w:type="spellEnd"/>
+      <w:proofErr w:type="gramEnd"/>
+      <w:r>
+        <w:t xml:space="preserve"> и README.md файлами. Загрузить лабораторную работу 1, и загрузить изменения на удаленный репозиторий путем сохранения изменений в коммитах.</w:t>
       </w:r>
     </w:p>
     <w:p>
@@ -365,25 +412,26 @@
       <w:r>
         <w:t>https://github.com/</w:t>
       </w:r>
+      <w:proofErr w:type="spellStart"/>
       <w:r>
         <w:rPr>
           <w:lang w:val="en-US"/>
         </w:rPr>
         <w:t>Filky</w:t>
       </w:r>
-      <w:r>
-        <w:t>1/cs-p</w:t>
-      </w:r>
-      <w:r>
-        <w:t>r</w:t>
-      </w:r>
-      <w:r>
-        <w:t>ogramming-labs.</w:t>
-      </w:r>
-      <w:hyperlink r:id="rId4">
+      <w:proofErr w:type="spellEnd"/>
+      <w:r>
+        <w:t>1/</w:t>
+      </w:r>
+      <w:proofErr w:type="spellStart"/>
+      <w:r>
+        <w:t>cs-programming-labs.</w:t>
+      </w:r>
+      <w:hyperlink r:id="rId6">
         <w:r>
           <w:t>git</w:t>
         </w:r>
+        <w:proofErr w:type="spellEnd"/>
       </w:hyperlink>
       <w:r>
         <w:t>.</w:t>
@@ -403,8 +451,13 @@
         <w:ind w:left="719"/>
       </w:pPr>
       <w:r>
-        <w:t>Изображение удаленного репозитория на сервисе github</w:t>
-      </w:r>
+        <w:t xml:space="preserve">Изображение удаленного репозитория на сервисе </w:t>
+      </w:r>
+      <w:proofErr w:type="spellStart"/>
+      <w:r>
+        <w:t>github</w:t>
+      </w:r>
+      <w:proofErr w:type="spellEnd"/>
       <w:r>
         <w:t xml:space="preserve"> </w:t>
       </w:r>
@@ -446,7 +499,7 @@
                     <pic:cNvPicPr/>
                   </pic:nvPicPr>
                   <pic:blipFill>
-                    <a:blip r:embed="rId5"/>
+                    <a:blip r:embed="rId7"/>
                     <a:stretch>
                       <a:fillRect/>
                     </a:stretch>
@@ -481,8 +534,13 @@
         <w:jc w:val="center"/>
       </w:pPr>
       <w:r>
-        <w:t>Рисунок 1 – Удаленный репозиторий github</w:t>
-      </w:r>
+        <w:t xml:space="preserve">Рисунок 1 – Удаленный репозиторий </w:t>
+      </w:r>
+      <w:proofErr w:type="spellStart"/>
+      <w:r>
+        <w:t>github</w:t>
+      </w:r>
+      <w:proofErr w:type="spellEnd"/>
     </w:p>
     <w:p>
       <w:pPr>
@@ -490,7 +548,15 @@
         <w:ind w:left="-15" w:firstLine="709"/>
       </w:pPr>
       <w:r>
-        <w:t>Структура локального репозитория согласована строго в рамках требований лаброторной работы.</w:t>
+        <w:t xml:space="preserve">Структура локального репозитория согласована строго в рамках требований </w:t>
+      </w:r>
+      <w:proofErr w:type="spellStart"/>
+      <w:r>
+        <w:t>лаброторной</w:t>
+      </w:r>
+      <w:proofErr w:type="spellEnd"/>
+      <w:r>
+        <w:t xml:space="preserve"> работы.</w:t>
       </w:r>
     </w:p>
     <w:p>
@@ -538,7 +604,7 @@
                     <pic:cNvPicPr/>
                   </pic:nvPicPr>
                   <pic:blipFill>
-                    <a:blip r:embed="rId6"/>
+                    <a:blip r:embed="rId8"/>
                     <a:stretch>
                       <a:fillRect/>
                     </a:stretch>
@@ -573,16 +639,91 @@
         <w:ind w:left="719"/>
       </w:pPr>
       <w:r>
-        <w:t>Поставленная цель лаброторной работы была достигнута</w:t>
+        <w:t xml:space="preserve">Поставленная цель </w:t>
+      </w:r>
+      <w:proofErr w:type="spellStart"/>
+      <w:r>
+        <w:t>лаброторной</w:t>
+      </w:r>
+      <w:proofErr w:type="spellEnd"/>
+      <w:r>
+        <w:t xml:space="preserve"> работы была достигнута</w:t>
       </w:r>
     </w:p>
     <w:sectPr>
+      <w:headerReference w:type="default" r:id="rId9"/>
       <w:pgSz w:w="11906" w:h="16838"/>
       <w:pgMar w:top="580" w:right="519" w:bottom="1082" w:left="1701" w:header="720" w:footer="720" w:gutter="0"/>
       <w:cols w:space="720"/>
     </w:sectPr>
   </w:body>
 </w:document>
+</file>
+
+<file path=word/endnotes.xml><?xml version="1.0" encoding="utf-8"?>
+<w:endnotes xmlns:wpc="http://schemas.microsoft.com/office/word/2010/wordprocessingCanvas" xmlns:cx="http://schemas.microsoft.com/office/drawing/2014/chartex" xmlns:cx1="http://schemas.microsoft.com/office/drawing/2015/9/8/chartex" xmlns:cx2="http://schemas.microsoft.com/office/drawing/2015/10/21/chartex" xmlns:cx3="http://schemas.microsoft.com/office/drawing/2016/5/9/chartex" xmlns:cx4="http://schemas.microsoft.com/office/drawing/2016/5/10/chartex" xmlns:cx5="http://schemas.microsoft.com/office/drawing/2016/5/11/chartex" xmlns:cx6="http://schemas.microsoft.com/office/drawing/2016/5/12/chartex" xmlns:cx7="http://schemas.microsoft.com/office/drawing/2016/5/13/chartex" xmlns:cx8="http://schemas.microsoft.com/office/drawing/2016/5/14/chartex" xmlns:mc="http://schemas.openxmlformats.org/markup-compatibility/2006" xmlns:aink="http://schemas.microsoft.com/office/drawing/2016/ink" xmlns:am3d="http://schemas.microsoft.com/office/drawing/2017/model3d" xmlns:o="urn:schemas-microsoft-com:office:office" xmlns:oel="http://schemas.microsoft.com/office/2019/extlst" xmlns:r="http://schemas.openxmlformats.org/officeDocument/2006/relationships" xmlns:m="http://schemas.openxmlformats.org/officeDocument/2006/math" xmlns:v="urn:schemas-microsoft-com:vml" xmlns:wp14="http://schemas.microsoft.com/office/word/2010/wordprocessingDrawing" xmlns:wp="http://schemas.openxmlformats.org/drawingml/2006/wordprocessingDrawing" xmlns:w10="urn:schemas-microsoft-com:office:word" xmlns:w="http://schemas.openxmlformats.org/wordprocessingml/2006/main" xmlns:w14="http://schemas.microsoft.com/office/word/2010/wordml" xmlns:w15="http://schemas.microsoft.com/office/word/2012/wordml" xmlns:w16cex="http://schemas.microsoft.com/office/word/2018/wordml/cex" xmlns:w16cid="http://schemas.microsoft.com/office/word/2016/wordml/cid" xmlns:w16="http://schemas.microsoft.com/office/word/2018/wordml" xmlns:w16du="http://schemas.microsoft.com/office/word/2023/wordml/word16du" xmlns:w16sdtdh="http://schemas.microsoft.com/office/word/2020/wordml/sdtdatahash" xmlns:w16sdtfl="http://schemas.microsoft.com/office/word/2024/wordml/sdtformatlock" xmlns:w16se="http://schemas.microsoft.com/office/word/2015/wordml/symex" xmlns:wpg="http://schemas.microsoft.com/office/word/2010/wordprocessingGroup" xmlns:wpi="http://schemas.microsoft.com/office/word/2010/wordprocessingInk" xmlns:wne="http://schemas.microsoft.com/office/word/2006/wordml" xmlns:wps="http://schemas.microsoft.com/office/word/2010/wordprocessingShape" mc:Ignorable="w14 w15 w16se w16cid w16 w16cex w16sdtdh w16sdtfl w16du wp14">
+  <w:endnote w:type="separator" w:id="-1">
+    <w:p>
+      <w:pPr>
+        <w:spacing w:after="0" w:line="240" w:lineRule="auto"/>
+      </w:pPr>
+      <w:r>
+        <w:separator/>
+      </w:r>
+    </w:p>
+  </w:endnote>
+  <w:endnote w:type="continuationSeparator" w:id="0">
+    <w:p>
+      <w:pPr>
+        <w:spacing w:after="0" w:line="240" w:lineRule="auto"/>
+      </w:pPr>
+      <w:r>
+        <w:continuationSeparator/>
+      </w:r>
+    </w:p>
+  </w:endnote>
+</w:endnotes>
+</file>
+
+<file path=word/footnotes.xml><?xml version="1.0" encoding="utf-8"?>
+<w:footnotes xmlns:wpc="http://schemas.microsoft.com/office/word/2010/wordprocessingCanvas" xmlns:cx="http://schemas.microsoft.com/office/drawing/2014/chartex" xmlns:cx1="http://schemas.microsoft.com/office/drawing/2015/9/8/chartex" xmlns:cx2="http://schemas.microsoft.com/office/drawing/2015/10/21/chartex" xmlns:cx3="http://schemas.microsoft.com/office/drawing/2016/5/9/chartex" xmlns:cx4="http://schemas.microsoft.com/office/drawing/2016/5/10/chartex" xmlns:cx5="http://schemas.microsoft.com/office/drawing/2016/5/11/chartex" xmlns:cx6="http://schemas.microsoft.com/office/drawing/2016/5/12/chartex" xmlns:cx7="http://schemas.microsoft.com/office/drawing/2016/5/13/chartex" xmlns:cx8="http://schemas.microsoft.com/office/drawing/2016/5/14/chartex" xmlns:mc="http://schemas.openxmlformats.org/markup-compatibility/2006" xmlns:aink="http://schemas.microsoft.com/office/drawing/2016/ink" xmlns:am3d="http://schemas.microsoft.com/office/drawing/2017/model3d" xmlns:o="urn:schemas-microsoft-com:office:office" xmlns:oel="http://schemas.microsoft.com/office/2019/extlst" xmlns:r="http://schemas.openxmlformats.org/officeDocument/2006/relationships" xmlns:m="http://schemas.openxmlformats.org/officeDocument/2006/math" xmlns:v="urn:schemas-microsoft-com:vml" xmlns:wp14="http://schemas.microsoft.com/office/word/2010/wordprocessingDrawing" xmlns:wp="http://schemas.openxmlformats.org/drawingml/2006/wordprocessingDrawing" xmlns:w10="urn:schemas-microsoft-com:office:word" xmlns:w="http://schemas.openxmlformats.org/wordprocessingml/2006/main" xmlns:w14="http://schemas.microsoft.com/office/word/2010/wordml" xmlns:w15="http://schemas.microsoft.com/office/word/2012/wordml" xmlns:w16cex="http://schemas.microsoft.com/office/word/2018/wordml/cex" xmlns:w16cid="http://schemas.microsoft.com/office/word/2016/wordml/cid" xmlns:w16="http://schemas.microsoft.com/office/word/2018/wordml" xmlns:w16du="http://schemas.microsoft.com/office/word/2023/wordml/word16du" xmlns:w16sdtdh="http://schemas.microsoft.com/office/word/2020/wordml/sdtdatahash" xmlns:w16sdtfl="http://schemas.microsoft.com/office/word/2024/wordml/sdtformatlock" xmlns:w16se="http://schemas.microsoft.com/office/word/2015/wordml/symex" xmlns:wpg="http://schemas.microsoft.com/office/word/2010/wordprocessingGroup" xmlns:wpi="http://schemas.microsoft.com/office/word/2010/wordprocessingInk" xmlns:wne="http://schemas.microsoft.com/office/word/2006/wordml" xmlns:wps="http://schemas.microsoft.com/office/word/2010/wordprocessingShape" mc:Ignorable="w14 w15 w16se w16cid w16 w16cex w16sdtdh w16sdtfl w16du wp14">
+  <w:footnote w:type="separator" w:id="-1">
+    <w:p>
+      <w:pPr>
+        <w:spacing w:after="0" w:line="240" w:lineRule="auto"/>
+      </w:pPr>
+      <w:r>
+        <w:separator/>
+      </w:r>
+    </w:p>
+  </w:footnote>
+  <w:footnote w:type="continuationSeparator" w:id="0">
+    <w:p>
+      <w:pPr>
+        <w:spacing w:after="0" w:line="240" w:lineRule="auto"/>
+      </w:pPr>
+      <w:r>
+        <w:continuationSeparator/>
+      </w:r>
+    </w:p>
+  </w:footnote>
+</w:footnotes>
+</file>
+
+<file path=word/header1.xml><?xml version="1.0" encoding="utf-8"?>
+<w:hdr xmlns:wpc="http://schemas.microsoft.com/office/word/2010/wordprocessingCanvas" xmlns:cx="http://schemas.microsoft.com/office/drawing/2014/chartex" xmlns:cx1="http://schemas.microsoft.com/office/drawing/2015/9/8/chartex" xmlns:cx2="http://schemas.microsoft.com/office/drawing/2015/10/21/chartex" xmlns:cx3="http://schemas.microsoft.com/office/drawing/2016/5/9/chartex" xmlns:cx4="http://schemas.microsoft.com/office/drawing/2016/5/10/chartex" xmlns:cx5="http://schemas.microsoft.com/office/drawing/2016/5/11/chartex" xmlns:cx6="http://schemas.microsoft.com/office/drawing/2016/5/12/chartex" xmlns:cx7="http://schemas.microsoft.com/office/drawing/2016/5/13/chartex" xmlns:cx8="http://schemas.microsoft.com/office/drawing/2016/5/14/chartex" xmlns:mc="http://schemas.openxmlformats.org/markup-compatibility/2006" xmlns:aink="http://schemas.microsoft.com/office/drawing/2016/ink" xmlns:am3d="http://schemas.microsoft.com/office/drawing/2017/model3d" xmlns:o="urn:schemas-microsoft-com:office:office" xmlns:oel="http://schemas.microsoft.com/office/2019/extlst" xmlns:r="http://schemas.openxmlformats.org/officeDocument/2006/relationships" xmlns:m="http://schemas.openxmlformats.org/officeDocument/2006/math" xmlns:v="urn:schemas-microsoft-com:vml" xmlns:wp14="http://schemas.microsoft.com/office/word/2010/wordprocessingDrawing" xmlns:wp="http://schemas.openxmlformats.org/drawingml/2006/wordprocessingDrawing" xmlns:w10="urn:schemas-microsoft-com:office:word" xmlns:w="http://schemas.openxmlformats.org/wordprocessingml/2006/main" xmlns:w14="http://schemas.microsoft.com/office/word/2010/wordml" xmlns:w15="http://schemas.microsoft.com/office/word/2012/wordml" xmlns:w16cex="http://schemas.microsoft.com/office/word/2018/wordml/cex" xmlns:w16cid="http://schemas.microsoft.com/office/word/2016/wordml/cid" xmlns:w16="http://schemas.microsoft.com/office/word/2018/wordml" xmlns:w16du="http://schemas.microsoft.com/office/word/2023/wordml/word16du" xmlns:w16sdtdh="http://schemas.microsoft.com/office/word/2020/wordml/sdtdatahash" xmlns:w16sdtfl="http://schemas.microsoft.com/office/word/2024/wordml/sdtformatlock" xmlns:w16se="http://schemas.microsoft.com/office/word/2015/wordml/symex" xmlns:wpg="http://schemas.microsoft.com/office/word/2010/wordprocessingGroup" xmlns:wpi="http://schemas.microsoft.com/office/word/2010/wordprocessingInk" xmlns:wne="http://schemas.microsoft.com/office/word/2006/wordml" xmlns:wps="http://schemas.microsoft.com/office/word/2010/wordprocessingShape" mc:Ignorable="w14 w15 w16se w16cid w16 w16cex w16sdtdh w16sdtfl w16du wp14">
+  <w:p>
+    <w:pPr>
+      <w:pStyle w:val="a6"/>
+      <w:jc w:val="right"/>
+    </w:pPr>
+  </w:p>
+  <w:p>
+    <w:pPr>
+      <w:pStyle w:val="a6"/>
+    </w:pPr>
+  </w:p>
+</w:hdr>
 </file>
 
 <file path=word/styles.xml><?xml version="1.0" encoding="utf-8"?>
@@ -1086,6 +1227,58 @@
       <w:u w:val="single"/>
     </w:rPr>
   </w:style>
+  <w:style w:type="paragraph" w:styleId="a6">
+    <w:name w:val="header"/>
+    <w:basedOn w:val="a"/>
+    <w:link w:val="a7"/>
+    <w:uiPriority w:val="99"/>
+    <w:unhideWhenUsed/>
+    <w:rsid w:val="00D1687F"/>
+    <w:pPr>
+      <w:tabs>
+        <w:tab w:val="center" w:pos="4677"/>
+        <w:tab w:val="right" w:pos="9355"/>
+      </w:tabs>
+      <w:spacing w:after="0" w:line="240" w:lineRule="auto"/>
+    </w:pPr>
+  </w:style>
+  <w:style w:type="character" w:customStyle="1" w:styleId="a7">
+    <w:name w:val="Верхний колонтитул Знак"/>
+    <w:basedOn w:val="a0"/>
+    <w:link w:val="a6"/>
+    <w:uiPriority w:val="99"/>
+    <w:rsid w:val="00D1687F"/>
+    <w:rPr>
+      <w:rFonts w:ascii="Times New Roman" w:eastAsia="Times New Roman" w:hAnsi="Times New Roman" w:cs="Times New Roman"/>
+      <w:color w:val="000000"/>
+    </w:rPr>
+  </w:style>
+  <w:style w:type="paragraph" w:styleId="a8">
+    <w:name w:val="footer"/>
+    <w:basedOn w:val="a"/>
+    <w:link w:val="a9"/>
+    <w:uiPriority w:val="99"/>
+    <w:unhideWhenUsed/>
+    <w:rsid w:val="00D1687F"/>
+    <w:pPr>
+      <w:tabs>
+        <w:tab w:val="center" w:pos="4677"/>
+        <w:tab w:val="right" w:pos="9355"/>
+      </w:tabs>
+      <w:spacing w:after="0" w:line="240" w:lineRule="auto"/>
+    </w:pPr>
+  </w:style>
+  <w:style w:type="character" w:customStyle="1" w:styleId="a9">
+    <w:name w:val="Нижний колонтитул Знак"/>
+    <w:basedOn w:val="a0"/>
+    <w:link w:val="a8"/>
+    <w:uiPriority w:val="99"/>
+    <w:rsid w:val="00D1687F"/>
+    <w:rPr>
+      <w:rFonts w:ascii="Times New Roman" w:eastAsia="Times New Roman" w:hAnsi="Times New Roman" w:cs="Times New Roman"/>
+      <w:color w:val="000000"/>
+    </w:rPr>
+  </w:style>
 </w:styles>
 </file>
 

</xml_diff>